<commit_message>
Actualizacion automatica - 2026-03-01 22:59 hora Guatemala
</commit_message>
<xml_diff>
--- a/2_Results/20260301/Boletin_Sipacate_BO010326.docx
+++ b/2_Results/20260301/Boletin_Sipacate_BO010326.docx
@@ -143,60 +143,6 @@
                 <pic:pic>
                   <pic:nvPicPr>
                     <pic:cNvPr id="0" name="Serie_ciclo_diario_wind_direction_10m_20260301.png"/>
-                    <pic:cNvPicPr/>
-                  </pic:nvPicPr>
-                  <pic:blipFill>
-                    <a:blip r:embed="rId10"/>
-                    <a:stretch>
-                      <a:fillRect/>
-                    </a:stretch>
-                  </pic:blipFill>
-                  <pic:spPr>
-                    <a:xfrm>
-                      <a:off x="0" y="0"/>
-                      <a:ext cx="5486400" cy="2428952"/>
-                    </a:xfrm>
-                    <a:prstGeom prst="rect"/>
-                  </pic:spPr>
-                </pic:pic>
-              </a:graphicData>
-            </a:graphic>
-          </wp:inline>
-        </w:drawing>
-      </w:r>
-    </w:p>
-    <w:p>
-      <w:pPr>
-        <w:spacing w:after="160"/>
-      </w:pPr>
-    </w:p>
-    <w:p>
-      <w:pPr>
-        <w:spacing w:before="120" w:after="80"/>
-        <w:jc w:val="center"/>
-      </w:pPr>
-      <w:r>
-        <w:rPr>
-          <w:b/>
-          <w:sz w:val="22"/>
-        </w:rPr>
-        <w:t>Dirección del viento a 100 metros</w:t>
-      </w:r>
-    </w:p>
-    <w:p>
-      <w:r>
-        <w:drawing>
-          <wp:inline xmlns:a="http://schemas.openxmlformats.org/drawingml/2006/main" xmlns:pic="http://schemas.openxmlformats.org/drawingml/2006/picture">
-            <wp:extent cx="5486400" cy="2428952"/>
-            <wp:docPr id="2" name="Picture 2"/>
-            <wp:cNvGraphicFramePr>
-              <a:graphicFrameLocks noChangeAspect="1"/>
-            </wp:cNvGraphicFramePr>
-            <a:graphic>
-              <a:graphicData uri="http://schemas.openxmlformats.org/drawingml/2006/picture">
-                <pic:pic>
-                  <pic:nvPicPr>
-                    <pic:cNvPr id="0" name="Serie_ciclo_diario_wind_direction_100m_20260301.png"/>
                     <pic:cNvPicPr/>
                   </pic:nvPicPr>
                   <pic:blipFill>
@@ -234,6 +180,60 @@
           <w:b/>
           <w:sz w:val="22"/>
         </w:rPr>
+        <w:t>Dirección del viento a 100 metros</w:t>
+      </w:r>
+    </w:p>
+    <w:p>
+      <w:r>
+        <w:drawing>
+          <wp:inline xmlns:a="http://schemas.openxmlformats.org/drawingml/2006/main" xmlns:pic="http://schemas.openxmlformats.org/drawingml/2006/picture">
+            <wp:extent cx="5486400" cy="2428952"/>
+            <wp:docPr id="2" name="Picture 2"/>
+            <wp:cNvGraphicFramePr>
+              <a:graphicFrameLocks noChangeAspect="1"/>
+            </wp:cNvGraphicFramePr>
+            <a:graphic>
+              <a:graphicData uri="http://schemas.openxmlformats.org/drawingml/2006/picture">
+                <pic:pic>
+                  <pic:nvPicPr>
+                    <pic:cNvPr id="0" name="Serie_ciclo_diario_wind_direction_100m_20260301.png"/>
+                    <pic:cNvPicPr/>
+                  </pic:nvPicPr>
+                  <pic:blipFill>
+                    <a:blip r:embed="rId12"/>
+                    <a:stretch>
+                      <a:fillRect/>
+                    </a:stretch>
+                  </pic:blipFill>
+                  <pic:spPr>
+                    <a:xfrm>
+                      <a:off x="0" y="0"/>
+                      <a:ext cx="5486400" cy="2428952"/>
+                    </a:xfrm>
+                    <a:prstGeom prst="rect"/>
+                  </pic:spPr>
+                </pic:pic>
+              </a:graphicData>
+            </a:graphic>
+          </wp:inline>
+        </w:drawing>
+      </w:r>
+    </w:p>
+    <w:p>
+      <w:pPr>
+        <w:spacing w:after="160"/>
+      </w:pPr>
+    </w:p>
+    <w:p>
+      <w:pPr>
+        <w:spacing w:before="120" w:after="80"/>
+        <w:jc w:val="center"/>
+      </w:pPr>
+      <w:r>
+        <w:rPr>
+          <w:b/>
+          <w:sz w:val="22"/>
+        </w:rPr>
         <w:t>Velocidad del viento a 10 metros</w:t>
       </w:r>
     </w:p>
@@ -251,60 +251,6 @@
                 <pic:pic>
                   <pic:nvPicPr>
                     <pic:cNvPr id="0" name="Serie_ciclo_diario_wind_speed_10m_20260301.png"/>
-                    <pic:cNvPicPr/>
-                  </pic:nvPicPr>
-                  <pic:blipFill>
-                    <a:blip r:embed="rId12"/>
-                    <a:stretch>
-                      <a:fillRect/>
-                    </a:stretch>
-                  </pic:blipFill>
-                  <pic:spPr>
-                    <a:xfrm>
-                      <a:off x="0" y="0"/>
-                      <a:ext cx="5486400" cy="2432649"/>
-                    </a:xfrm>
-                    <a:prstGeom prst="rect"/>
-                  </pic:spPr>
-                </pic:pic>
-              </a:graphicData>
-            </a:graphic>
-          </wp:inline>
-        </w:drawing>
-      </w:r>
-    </w:p>
-    <w:p>
-      <w:pPr>
-        <w:spacing w:after="160"/>
-      </w:pPr>
-    </w:p>
-    <w:p>
-      <w:pPr>
-        <w:spacing w:before="120" w:after="80"/>
-        <w:jc w:val="center"/>
-      </w:pPr>
-      <w:r>
-        <w:rPr>
-          <w:b/>
-          <w:sz w:val="22"/>
-        </w:rPr>
-        <w:t>Velocidad del viento a 100 metros</w:t>
-      </w:r>
-    </w:p>
-    <w:p>
-      <w:r>
-        <w:drawing>
-          <wp:inline xmlns:a="http://schemas.openxmlformats.org/drawingml/2006/main" xmlns:pic="http://schemas.openxmlformats.org/drawingml/2006/picture">
-            <wp:extent cx="5486400" cy="2432649"/>
-            <wp:docPr id="4" name="Picture 4"/>
-            <wp:cNvGraphicFramePr>
-              <a:graphicFrameLocks noChangeAspect="1"/>
-            </wp:cNvGraphicFramePr>
-            <a:graphic>
-              <a:graphicData uri="http://schemas.openxmlformats.org/drawingml/2006/picture">
-                <pic:pic>
-                  <pic:nvPicPr>
-                    <pic:cNvPr id="0" name="Serie_ciclo_diario_wind_speed_100m_20260301.png"/>
                     <pic:cNvPicPr/>
                   </pic:nvPicPr>
                   <pic:blipFill>
@@ -334,6 +280,60 @@
     </w:p>
     <w:p>
       <w:pPr>
+        <w:spacing w:before="120" w:after="80"/>
+        <w:jc w:val="center"/>
+      </w:pPr>
+      <w:r>
+        <w:rPr>
+          <w:b/>
+          <w:sz w:val="22"/>
+        </w:rPr>
+        <w:t>Velocidad del viento a 100 metros</w:t>
+      </w:r>
+    </w:p>
+    <w:p>
+      <w:r>
+        <w:drawing>
+          <wp:inline xmlns:a="http://schemas.openxmlformats.org/drawingml/2006/main" xmlns:pic="http://schemas.openxmlformats.org/drawingml/2006/picture">
+            <wp:extent cx="5486400" cy="2432649"/>
+            <wp:docPr id="4" name="Picture 4"/>
+            <wp:cNvGraphicFramePr>
+              <a:graphicFrameLocks noChangeAspect="1"/>
+            </wp:cNvGraphicFramePr>
+            <a:graphic>
+              <a:graphicData uri="http://schemas.openxmlformats.org/drawingml/2006/picture">
+                <pic:pic>
+                  <pic:nvPicPr>
+                    <pic:cNvPr id="0" name="Serie_ciclo_diario_wind_speed_100m_20260301.png"/>
+                    <pic:cNvPicPr/>
+                  </pic:nvPicPr>
+                  <pic:blipFill>
+                    <a:blip r:embed="rId14"/>
+                    <a:stretch>
+                      <a:fillRect/>
+                    </a:stretch>
+                  </pic:blipFill>
+                  <pic:spPr>
+                    <a:xfrm>
+                      <a:off x="0" y="0"/>
+                      <a:ext cx="5486400" cy="2432649"/>
+                    </a:xfrm>
+                    <a:prstGeom prst="rect"/>
+                  </pic:spPr>
+                </pic:pic>
+              </a:graphicData>
+            </a:graphic>
+          </wp:inline>
+        </w:drawing>
+      </w:r>
+    </w:p>
+    <w:p>
+      <w:pPr>
+        <w:spacing w:after="160"/>
+      </w:pPr>
+    </w:p>
+    <w:p>
+      <w:pPr>
         <w:spacing w:before="240" w:after="160"/>
       </w:pPr>
       <w:r>
@@ -441,7 +441,7 @@
       </w:r>
     </w:p>
     <w:sectPr>
-      <w:headerReference w:type="default" r:id="rId7"/>
+      <w:headerReference w:type="default" r:id="rId8"/>
       <w:pgSz w:w="12240" w:h="15840"/>
       <w:pgMar w:top="1417" w:right="1701" w:bottom="1417" w:left="1701" w:header="708" w:footer="708" w:gutter="0"/>
       <w:cols w:space="708"/>
@@ -512,18 +512,18 @@
         <w:noProof/>
       </w:rPr>
       <w:drawing>
-        <wp:anchor distT="0" distB="0" distL="114300" distR="114300" simplePos="0" relativeHeight="251658240" behindDoc="1" locked="1" layoutInCell="1" allowOverlap="1" wp14:anchorId="253B9802" wp14:editId="41A3294E">
+        <wp:anchor distT="0" distB="0" distL="114300" distR="114300" simplePos="0" relativeHeight="251659264" behindDoc="1" locked="1" layoutInCell="1" allowOverlap="1" wp14:anchorId="59AA2216" wp14:editId="45BF8A99">
           <wp:simplePos x="0" y="0"/>
           <wp:positionH relativeFrom="page">
-            <wp:align>right</wp:align>
+            <wp:posOffset>6570345</wp:posOffset>
           </wp:positionH>
           <wp:positionV relativeFrom="paragraph">
-            <wp:posOffset>-440055</wp:posOffset>
+            <wp:posOffset>-368935</wp:posOffset>
           </wp:positionV>
-          <wp:extent cx="8029575" cy="10053955"/>
-          <wp:effectExtent l="0" t="0" r="9525" b="4445"/>
+          <wp:extent cx="1061720" cy="527685"/>
+          <wp:effectExtent l="0" t="0" r="5080" b="5715"/>
           <wp:wrapNone/>
-          <wp:docPr id="1587511429" name="Imagen 1" descr="Imagen que contiene Interfaz de usuario gráfica&#10;&#10;El contenido generado por IA puede ser incorrecto."/>
+          <wp:docPr id="1574606530" name="Imagen 1" descr="Imagen que contiene Interfaz de usuario gráfica&#10;&#10;El contenido generado por IA puede ser incorrecto."/>
           <wp:cNvGraphicFramePr>
             <a:graphicFrameLocks xmlns:a="http://schemas.openxmlformats.org/drawingml/2006/main" noChangeAspect="1"/>
           </wp:cNvGraphicFramePr>
@@ -534,20 +534,29 @@
                   <pic:cNvPr id="1587511429" name="Imagen 1" descr="Imagen que contiene Interfaz de usuario gráfica&#10;&#10;El contenido generado por IA puede ser incorrecto."/>
                   <pic:cNvPicPr/>
                 </pic:nvPicPr>
-                <pic:blipFill>
+                <pic:blipFill rotWithShape="1">
                   <a:blip r:embed="rId1"/>
+                  <a:srcRect l="7602" t="5272" r="70563" b="86502"/>
                   <a:stretch>
                     <a:fillRect/>
                   </a:stretch>
                 </pic:blipFill>
-                <pic:spPr>
+                <pic:spPr bwMode="auto">
                   <a:xfrm>
                     <a:off x="0" y="0"/>
-                    <a:ext cx="8029575" cy="10053955"/>
+                    <a:ext cx="1061720" cy="527685"/>
                   </a:xfrm>
                   <a:prstGeom prst="rect">
                     <a:avLst/>
                   </a:prstGeom>
+                  <a:ln>
+                    <a:noFill/>
+                  </a:ln>
+                  <a:extLst>
+                    <a:ext uri="{53640926-AAD7-44D8-BBD7-CCE9431645EC}">
+                      <a14:shadowObscured xmlns:a14="http://schemas.microsoft.com/office/drawing/2010/main"/>
+                    </a:ext>
+                  </a:extLst>
                 </pic:spPr>
               </pic:pic>
             </a:graphicData>

</xml_diff>

<commit_message>
Actualizacion automatica - 2026-03-01 23:02 hora Guatemala
</commit_message>
<xml_diff>
--- a/2_Results/20260301/Boletin_Sipacate_BO010326.docx
+++ b/2_Results/20260301/Boletin_Sipacate_BO010326.docx
@@ -16,6 +16,7 @@
     <w:p>
       <w:pPr>
         <w:spacing w:after="80" w:before="0"/>
+        <w:jc w:val="both"/>
       </w:pPr>
       <w:r>
         <w:rPr>
@@ -27,6 +28,7 @@
     <w:p>
       <w:pPr>
         <w:spacing w:after="80" w:before="0"/>
+        <w:jc w:val="both"/>
       </w:pPr>
       <w:r>
         <w:rPr>
@@ -38,6 +40,7 @@
     <w:p>
       <w:pPr>
         <w:spacing w:after="120" w:before="0"/>
+        <w:jc w:val="both"/>
       </w:pPr>
       <w:r>
         <w:rPr>
@@ -50,6 +53,7 @@
     <w:p>
       <w:pPr>
         <w:spacing w:after="200" w:before="0"/>
+        <w:jc w:val="both"/>
       </w:pPr>
       <w:r>
         <w:rPr>
@@ -61,6 +65,7 @@
     <w:p>
       <w:pPr>
         <w:spacing w:after="120"/>
+        <w:jc w:val="both"/>
       </w:pPr>
       <w:r>
         <w:rPr>
@@ -77,6 +82,7 @@
     <w:p>
       <w:pPr>
         <w:spacing w:after="80"/>
+        <w:jc w:val="both"/>
       </w:pPr>
       <w:r>
         <w:rPr>
@@ -91,6 +97,7 @@
     <w:p>
       <w:pPr>
         <w:spacing w:after="80"/>
+        <w:jc w:val="both"/>
       </w:pPr>
       <w:r>
         <w:rPr>
@@ -105,6 +112,7 @@
     <w:p>
       <w:pPr>
         <w:spacing w:after="240"/>
+        <w:jc w:val="both"/>
       </w:pPr>
       <w:r>
         <w:rPr>
@@ -118,7 +126,7 @@
     </w:p>
     <w:p>
       <w:pPr>
-        <w:spacing w:before="120" w:after="80"/>
+        <w:spacing w:before="80" w:after="80"/>
         <w:jc w:val="center"/>
       </w:pPr>
       <w:r>
@@ -130,10 +138,13 @@
       </w:r>
     </w:p>
     <w:p>
+      <w:pPr>
+        <w:jc w:val="center"/>
+      </w:pPr>
       <w:r>
         <w:drawing>
           <wp:inline xmlns:a="http://schemas.openxmlformats.org/drawingml/2006/main" xmlns:pic="http://schemas.openxmlformats.org/drawingml/2006/picture">
-            <wp:extent cx="5486400" cy="2428952"/>
+            <wp:extent cx="5303520" cy="2347987"/>
             <wp:docPr id="1" name="Picture 1"/>
             <wp:cNvGraphicFramePr>
               <a:graphicFrameLocks noChangeAspect="1"/>
@@ -154,7 +165,7 @@
                   <pic:spPr>
                     <a:xfrm>
                       <a:off x="0" y="0"/>
-                      <a:ext cx="5486400" cy="2428952"/>
+                      <a:ext cx="5303520" cy="2347987"/>
                     </a:xfrm>
                     <a:prstGeom prst="rect"/>
                   </pic:spPr>
@@ -167,12 +178,12 @@
     </w:p>
     <w:p>
       <w:pPr>
-        <w:spacing w:after="160"/>
-      </w:pPr>
-    </w:p>
-    <w:p>
-      <w:pPr>
-        <w:spacing w:before="120" w:after="80"/>
+        <w:spacing w:after="120"/>
+      </w:pPr>
+    </w:p>
+    <w:p>
+      <w:pPr>
+        <w:spacing w:before="80" w:after="80"/>
         <w:jc w:val="center"/>
       </w:pPr>
       <w:r>
@@ -184,10 +195,13 @@
       </w:r>
     </w:p>
     <w:p>
+      <w:pPr>
+        <w:jc w:val="center"/>
+      </w:pPr>
       <w:r>
         <w:drawing>
           <wp:inline xmlns:a="http://schemas.openxmlformats.org/drawingml/2006/main" xmlns:pic="http://schemas.openxmlformats.org/drawingml/2006/picture">
-            <wp:extent cx="5486400" cy="2428952"/>
+            <wp:extent cx="5303520" cy="2347987"/>
             <wp:docPr id="2" name="Picture 2"/>
             <wp:cNvGraphicFramePr>
               <a:graphicFrameLocks noChangeAspect="1"/>
@@ -208,7 +222,7 @@
                   <pic:spPr>
                     <a:xfrm>
                       <a:off x="0" y="0"/>
-                      <a:ext cx="5486400" cy="2428952"/>
+                      <a:ext cx="5303520" cy="2347987"/>
                     </a:xfrm>
                     <a:prstGeom prst="rect"/>
                   </pic:spPr>
@@ -220,13 +234,13 @@
       </w:r>
     </w:p>
     <w:p>
-      <w:pPr>
-        <w:spacing w:after="160"/>
-      </w:pPr>
-    </w:p>
-    <w:p>
-      <w:pPr>
-        <w:spacing w:before="120" w:after="80"/>
+      <w:r>
+        <w:br w:type="page"/>
+      </w:r>
+    </w:p>
+    <w:p>
+      <w:pPr>
+        <w:spacing w:before="80" w:after="80"/>
         <w:jc w:val="center"/>
       </w:pPr>
       <w:r>
@@ -238,10 +252,13 @@
       </w:r>
     </w:p>
     <w:p>
+      <w:pPr>
+        <w:jc w:val="center"/>
+      </w:pPr>
       <w:r>
         <w:drawing>
           <wp:inline xmlns:a="http://schemas.openxmlformats.org/drawingml/2006/main" xmlns:pic="http://schemas.openxmlformats.org/drawingml/2006/picture">
-            <wp:extent cx="5486400" cy="2432649"/>
+            <wp:extent cx="5303520" cy="2351561"/>
             <wp:docPr id="3" name="Picture 3"/>
             <wp:cNvGraphicFramePr>
               <a:graphicFrameLocks noChangeAspect="1"/>
@@ -262,7 +279,7 @@
                   <pic:spPr>
                     <a:xfrm>
                       <a:off x="0" y="0"/>
-                      <a:ext cx="5486400" cy="2432649"/>
+                      <a:ext cx="5303520" cy="2351561"/>
                     </a:xfrm>
                     <a:prstGeom prst="rect"/>
                   </pic:spPr>
@@ -275,12 +292,12 @@
     </w:p>
     <w:p>
       <w:pPr>
-        <w:spacing w:after="160"/>
-      </w:pPr>
-    </w:p>
-    <w:p>
-      <w:pPr>
-        <w:spacing w:before="120" w:after="80"/>
+        <w:spacing w:after="120"/>
+      </w:pPr>
+    </w:p>
+    <w:p>
+      <w:pPr>
+        <w:spacing w:before="80" w:after="80"/>
         <w:jc w:val="center"/>
       </w:pPr>
       <w:r>
@@ -292,10 +309,13 @@
       </w:r>
     </w:p>
     <w:p>
+      <w:pPr>
+        <w:jc w:val="center"/>
+      </w:pPr>
       <w:r>
         <w:drawing>
           <wp:inline xmlns:a="http://schemas.openxmlformats.org/drawingml/2006/main" xmlns:pic="http://schemas.openxmlformats.org/drawingml/2006/picture">
-            <wp:extent cx="5486400" cy="2432649"/>
+            <wp:extent cx="5303520" cy="2351561"/>
             <wp:docPr id="4" name="Picture 4"/>
             <wp:cNvGraphicFramePr>
               <a:graphicFrameLocks noChangeAspect="1"/>
@@ -316,7 +336,7 @@
                   <pic:spPr>
                     <a:xfrm>
                       <a:off x="0" y="0"/>
-                      <a:ext cx="5486400" cy="2432649"/>
+                      <a:ext cx="5303520" cy="2351561"/>
                     </a:xfrm>
                     <a:prstGeom prst="rect"/>
                   </pic:spPr>
@@ -329,11 +349,6 @@
     </w:p>
     <w:p>
       <w:pPr>
-        <w:spacing w:after="160"/>
-      </w:pPr>
-    </w:p>
-    <w:p>
-      <w:pPr>
         <w:spacing w:before="240" w:after="160"/>
       </w:pPr>
       <w:r>
@@ -347,6 +362,7 @@
     <w:p>
       <w:pPr>
         <w:spacing w:after="200"/>
+        <w:jc w:val="both"/>
       </w:pPr>
       <w:r>
         <w:rPr>
@@ -361,6 +377,7 @@
     <w:p>
       <w:pPr>
         <w:spacing w:after="200"/>
+        <w:jc w:val="both"/>
       </w:pPr>
       <w:r>
         <w:rPr>
@@ -375,6 +392,7 @@
     <w:p>
       <w:pPr>
         <w:spacing w:after="200"/>
+        <w:jc w:val="both"/>
       </w:pPr>
       <w:r>
         <w:rPr>
@@ -401,6 +419,7 @@
     <w:p>
       <w:pPr>
         <w:spacing w:after="200"/>
+        <w:jc w:val="both"/>
       </w:pPr>
       <w:r>
         <w:rPr>
@@ -415,6 +434,7 @@
     <w:p>
       <w:pPr>
         <w:spacing w:after="200"/>
+        <w:jc w:val="both"/>
       </w:pPr>
       <w:r>
         <w:rPr>
@@ -429,6 +449,7 @@
     <w:p>
       <w:pPr>
         <w:spacing w:after="200"/>
+        <w:jc w:val="both"/>
       </w:pPr>
       <w:r>
         <w:rPr>

</xml_diff>

<commit_message>
Actualizacion automatica - 2026-03-01 23:05 hora Guatemala
</commit_message>
<xml_diff>
--- a/2_Results/20260301/Boletin_Sipacate_BO010326.docx
+++ b/2_Results/20260301/Boletin_Sipacate_BO010326.docx
@@ -154,6 +154,63 @@
                 <pic:pic>
                   <pic:nvPicPr>
                     <pic:cNvPr id="0" name="Serie_ciclo_diario_wind_direction_10m_20260301.png"/>
+                    <pic:cNvPicPr/>
+                  </pic:nvPicPr>
+                  <pic:blipFill>
+                    <a:blip r:embed="rId10"/>
+                    <a:stretch>
+                      <a:fillRect/>
+                    </a:stretch>
+                  </pic:blipFill>
+                  <pic:spPr>
+                    <a:xfrm>
+                      <a:off x="0" y="0"/>
+                      <a:ext cx="5303520" cy="2347987"/>
+                    </a:xfrm>
+                    <a:prstGeom prst="rect"/>
+                  </pic:spPr>
+                </pic:pic>
+              </a:graphicData>
+            </a:graphic>
+          </wp:inline>
+        </w:drawing>
+      </w:r>
+    </w:p>
+    <w:p>
+      <w:pPr>
+        <w:spacing w:after="120"/>
+      </w:pPr>
+    </w:p>
+    <w:p>
+      <w:pPr>
+        <w:spacing w:before="80" w:after="80"/>
+        <w:jc w:val="center"/>
+      </w:pPr>
+      <w:r>
+        <w:rPr>
+          <w:b/>
+          <w:sz w:val="22"/>
+        </w:rPr>
+        <w:t>Dirección del viento a 100 metros</w:t>
+      </w:r>
+    </w:p>
+    <w:p>
+      <w:pPr>
+        <w:jc w:val="center"/>
+      </w:pPr>
+      <w:r>
+        <w:drawing>
+          <wp:inline xmlns:a="http://schemas.openxmlformats.org/drawingml/2006/main" xmlns:pic="http://schemas.openxmlformats.org/drawingml/2006/picture">
+            <wp:extent cx="5303520" cy="2347987"/>
+            <wp:docPr id="2" name="Picture 2"/>
+            <wp:cNvGraphicFramePr>
+              <a:graphicFrameLocks noChangeAspect="1"/>
+            </wp:cNvGraphicFramePr>
+            <a:graphic>
+              <a:graphicData uri="http://schemas.openxmlformats.org/drawingml/2006/picture">
+                <pic:pic>
+                  <pic:nvPicPr>
+                    <pic:cNvPr id="0" name="Serie_ciclo_diario_wind_direction_100m_20260301.png"/>
                     <pic:cNvPicPr/>
                   </pic:nvPicPr>
                   <pic:blipFill>
@@ -177,63 +234,6 @@
       </w:r>
     </w:p>
     <w:p>
-      <w:pPr>
-        <w:spacing w:after="120"/>
-      </w:pPr>
-    </w:p>
-    <w:p>
-      <w:pPr>
-        <w:spacing w:before="80" w:after="80"/>
-        <w:jc w:val="center"/>
-      </w:pPr>
-      <w:r>
-        <w:rPr>
-          <w:b/>
-          <w:sz w:val="22"/>
-        </w:rPr>
-        <w:t>Dirección del viento a 100 metros</w:t>
-      </w:r>
-    </w:p>
-    <w:p>
-      <w:pPr>
-        <w:jc w:val="center"/>
-      </w:pPr>
-      <w:r>
-        <w:drawing>
-          <wp:inline xmlns:a="http://schemas.openxmlformats.org/drawingml/2006/main" xmlns:pic="http://schemas.openxmlformats.org/drawingml/2006/picture">
-            <wp:extent cx="5303520" cy="2347987"/>
-            <wp:docPr id="2" name="Picture 2"/>
-            <wp:cNvGraphicFramePr>
-              <a:graphicFrameLocks noChangeAspect="1"/>
-            </wp:cNvGraphicFramePr>
-            <a:graphic>
-              <a:graphicData uri="http://schemas.openxmlformats.org/drawingml/2006/picture">
-                <pic:pic>
-                  <pic:nvPicPr>
-                    <pic:cNvPr id="0" name="Serie_ciclo_diario_wind_direction_100m_20260301.png"/>
-                    <pic:cNvPicPr/>
-                  </pic:nvPicPr>
-                  <pic:blipFill>
-                    <a:blip r:embed="rId12"/>
-                    <a:stretch>
-                      <a:fillRect/>
-                    </a:stretch>
-                  </pic:blipFill>
-                  <pic:spPr>
-                    <a:xfrm>
-                      <a:off x="0" y="0"/>
-                      <a:ext cx="5303520" cy="2347987"/>
-                    </a:xfrm>
-                    <a:prstGeom prst="rect"/>
-                  </pic:spPr>
-                </pic:pic>
-              </a:graphicData>
-            </a:graphic>
-          </wp:inline>
-        </w:drawing>
-      </w:r>
-    </w:p>
-    <w:p>
       <w:r>
         <w:br w:type="page"/>
       </w:r>
@@ -268,6 +268,63 @@
                 <pic:pic>
                   <pic:nvPicPr>
                     <pic:cNvPr id="0" name="Serie_ciclo_diario_wind_speed_10m_20260301.png"/>
+                    <pic:cNvPicPr/>
+                  </pic:nvPicPr>
+                  <pic:blipFill>
+                    <a:blip r:embed="rId12"/>
+                    <a:stretch>
+                      <a:fillRect/>
+                    </a:stretch>
+                  </pic:blipFill>
+                  <pic:spPr>
+                    <a:xfrm>
+                      <a:off x="0" y="0"/>
+                      <a:ext cx="5303520" cy="2351561"/>
+                    </a:xfrm>
+                    <a:prstGeom prst="rect"/>
+                  </pic:spPr>
+                </pic:pic>
+              </a:graphicData>
+            </a:graphic>
+          </wp:inline>
+        </w:drawing>
+      </w:r>
+    </w:p>
+    <w:p>
+      <w:pPr>
+        <w:spacing w:after="120"/>
+      </w:pPr>
+    </w:p>
+    <w:p>
+      <w:pPr>
+        <w:spacing w:before="80" w:after="80"/>
+        <w:jc w:val="center"/>
+      </w:pPr>
+      <w:r>
+        <w:rPr>
+          <w:b/>
+          <w:sz w:val="22"/>
+        </w:rPr>
+        <w:t>Velocidad del viento a 100 metros</w:t>
+      </w:r>
+    </w:p>
+    <w:p>
+      <w:pPr>
+        <w:jc w:val="center"/>
+      </w:pPr>
+      <w:r>
+        <w:drawing>
+          <wp:inline xmlns:a="http://schemas.openxmlformats.org/drawingml/2006/main" xmlns:pic="http://schemas.openxmlformats.org/drawingml/2006/picture">
+            <wp:extent cx="5303520" cy="2351561"/>
+            <wp:docPr id="4" name="Picture 4"/>
+            <wp:cNvGraphicFramePr>
+              <a:graphicFrameLocks noChangeAspect="1"/>
+            </wp:cNvGraphicFramePr>
+            <a:graphic>
+              <a:graphicData uri="http://schemas.openxmlformats.org/drawingml/2006/picture">
+                <pic:pic>
+                  <pic:nvPicPr>
+                    <pic:cNvPr id="0" name="Serie_ciclo_diario_wind_speed_100m_20260301.png"/>
                     <pic:cNvPicPr/>
                   </pic:nvPicPr>
                   <pic:blipFill>
@@ -292,63 +349,6 @@
     </w:p>
     <w:p>
       <w:pPr>
-        <w:spacing w:after="120"/>
-      </w:pPr>
-    </w:p>
-    <w:p>
-      <w:pPr>
-        <w:spacing w:before="80" w:after="80"/>
-        <w:jc w:val="center"/>
-      </w:pPr>
-      <w:r>
-        <w:rPr>
-          <w:b/>
-          <w:sz w:val="22"/>
-        </w:rPr>
-        <w:t>Velocidad del viento a 100 metros</w:t>
-      </w:r>
-    </w:p>
-    <w:p>
-      <w:pPr>
-        <w:jc w:val="center"/>
-      </w:pPr>
-      <w:r>
-        <w:drawing>
-          <wp:inline xmlns:a="http://schemas.openxmlformats.org/drawingml/2006/main" xmlns:pic="http://schemas.openxmlformats.org/drawingml/2006/picture">
-            <wp:extent cx="5303520" cy="2351561"/>
-            <wp:docPr id="4" name="Picture 4"/>
-            <wp:cNvGraphicFramePr>
-              <a:graphicFrameLocks noChangeAspect="1"/>
-            </wp:cNvGraphicFramePr>
-            <a:graphic>
-              <a:graphicData uri="http://schemas.openxmlformats.org/drawingml/2006/picture">
-                <pic:pic>
-                  <pic:nvPicPr>
-                    <pic:cNvPr id="0" name="Serie_ciclo_diario_wind_speed_100m_20260301.png"/>
-                    <pic:cNvPicPr/>
-                  </pic:nvPicPr>
-                  <pic:blipFill>
-                    <a:blip r:embed="rId14"/>
-                    <a:stretch>
-                      <a:fillRect/>
-                    </a:stretch>
-                  </pic:blipFill>
-                  <pic:spPr>
-                    <a:xfrm>
-                      <a:off x="0" y="0"/>
-                      <a:ext cx="5303520" cy="2351561"/>
-                    </a:xfrm>
-                    <a:prstGeom prst="rect"/>
-                  </pic:spPr>
-                </pic:pic>
-              </a:graphicData>
-            </a:graphic>
-          </wp:inline>
-        </w:drawing>
-      </w:r>
-    </w:p>
-    <w:p>
-      <w:pPr>
         <w:spacing w:before="240" w:after="160"/>
       </w:pPr>
       <w:r>
@@ -462,7 +462,7 @@
       </w:r>
     </w:p>
     <w:sectPr>
-      <w:headerReference w:type="default" r:id="rId8"/>
+      <w:headerReference w:type="default" r:id="rId7"/>
       <w:pgSz w:w="12240" w:h="15840"/>
       <w:pgMar w:top="1417" w:right="1701" w:bottom="1417" w:left="1701" w:header="708" w:footer="708" w:gutter="0"/>
       <w:cols w:space="708"/>
@@ -533,13 +533,76 @@
         <w:noProof/>
       </w:rPr>
       <w:drawing>
-        <wp:anchor distT="0" distB="0" distL="114300" distR="114300" simplePos="0" relativeHeight="251659264" behindDoc="1" locked="1" layoutInCell="1" allowOverlap="1" wp14:anchorId="59AA2216" wp14:editId="45BF8A99">
+        <wp:anchor distT="0" distB="0" distL="114300" distR="114300" simplePos="0" relativeHeight="251661312" behindDoc="1" locked="1" layoutInCell="1" allowOverlap="1" wp14:anchorId="652D97E8" wp14:editId="53F5DDB9">
           <wp:simplePos x="0" y="0"/>
           <wp:positionH relativeFrom="page">
-            <wp:posOffset>6570345</wp:posOffset>
+            <wp:align>left</wp:align>
           </wp:positionH>
           <wp:positionV relativeFrom="paragraph">
-            <wp:posOffset>-368935</wp:posOffset>
+            <wp:posOffset>436880</wp:posOffset>
+          </wp:positionV>
+          <wp:extent cx="8029575" cy="9164320"/>
+          <wp:effectExtent l="0" t="0" r="9525" b="0"/>
+          <wp:wrapNone/>
+          <wp:docPr id="1587511429" name="Imagen 1" descr="Imagen que contiene Interfaz de usuario gráfica&#10;&#10;El contenido generado por IA puede ser incorrecto."/>
+          <wp:cNvGraphicFramePr>
+            <a:graphicFrameLocks xmlns:a="http://schemas.openxmlformats.org/drawingml/2006/main" noChangeAspect="1"/>
+          </wp:cNvGraphicFramePr>
+          <a:graphic xmlns:a="http://schemas.openxmlformats.org/drawingml/2006/main">
+            <a:graphicData uri="http://schemas.openxmlformats.org/drawingml/2006/picture">
+              <pic:pic xmlns:pic="http://schemas.openxmlformats.org/drawingml/2006/picture">
+                <pic:nvPicPr>
+                  <pic:cNvPr id="1587511429" name="Imagen 1" descr="Imagen que contiene Interfaz de usuario gráfica&#10;&#10;El contenido generado por IA puede ser incorrecto."/>
+                  <pic:cNvPicPr/>
+                </pic:nvPicPr>
+                <pic:blipFill rotWithShape="1">
+                  <a:blip r:embed="rId1"/>
+                  <a:srcRect t="13599"/>
+                  <a:stretch>
+                    <a:fillRect/>
+                  </a:stretch>
+                </pic:blipFill>
+                <pic:spPr bwMode="auto">
+                  <a:xfrm>
+                    <a:off x="0" y="0"/>
+                    <a:ext cx="8029575" cy="9164320"/>
+                  </a:xfrm>
+                  <a:prstGeom prst="rect">
+                    <a:avLst/>
+                  </a:prstGeom>
+                  <a:ln>
+                    <a:noFill/>
+                  </a:ln>
+                  <a:extLst>
+                    <a:ext uri="{53640926-AAD7-44D8-BBD7-CCE9431645EC}">
+                      <a14:shadowObscured xmlns:a14="http://schemas.microsoft.com/office/drawing/2010/main"/>
+                    </a:ext>
+                  </a:extLst>
+                </pic:spPr>
+              </pic:pic>
+            </a:graphicData>
+          </a:graphic>
+          <wp14:sizeRelH relativeFrom="page">
+            <wp14:pctWidth>0</wp14:pctWidth>
+          </wp14:sizeRelH>
+          <wp14:sizeRelV relativeFrom="page">
+            <wp14:pctHeight>0</wp14:pctHeight>
+          </wp14:sizeRelV>
+        </wp:anchor>
+      </w:drawing>
+    </w:r>
+    <w:r>
+      <w:rPr>
+        <w:noProof/>
+      </w:rPr>
+      <w:drawing>
+        <wp:anchor distT="0" distB="0" distL="114300" distR="114300" simplePos="0" relativeHeight="251659264" behindDoc="1" locked="1" layoutInCell="1" allowOverlap="1" wp14:anchorId="59AA2216" wp14:editId="087D8C23">
+          <wp:simplePos x="0" y="0"/>
+          <wp:positionH relativeFrom="page">
+            <wp:posOffset>6376670</wp:posOffset>
+          </wp:positionH>
+          <wp:positionV relativeFrom="paragraph">
+            <wp:posOffset>-92075</wp:posOffset>
           </wp:positionV>
           <wp:extent cx="1061720" cy="527685"/>
           <wp:effectExtent l="0" t="0" r="5080" b="5715"/>

</xml_diff>

<commit_message>
Actualizacion automatica - 2026-03-01 23:13 hora Guatemala
</commit_message>
<xml_diff>
--- a/2_Results/20260301/Boletin_Sipacate_BO010326.docx
+++ b/2_Results/20260301/Boletin_Sipacate_BO010326.docx
@@ -15,8 +15,7 @@
     </w:p>
     <w:p>
       <w:pPr>
-        <w:spacing w:after="80" w:before="0"/>
-        <w:jc w:val="both"/>
+        <w:spacing w:after="80"/>
       </w:pPr>
       <w:r>
         <w:rPr>
@@ -27,8 +26,7 @@
     </w:p>
     <w:p>
       <w:pPr>
-        <w:spacing w:after="80" w:before="0"/>
-        <w:jc w:val="both"/>
+        <w:spacing w:after="80"/>
       </w:pPr>
       <w:r>
         <w:rPr>
@@ -39,8 +37,7 @@
     </w:p>
     <w:p>
       <w:pPr>
-        <w:spacing w:after="120" w:before="0"/>
-        <w:jc w:val="both"/>
+        <w:spacing w:after="120"/>
       </w:pPr>
       <w:r>
         <w:rPr>
@@ -52,13 +49,10 @@
     </w:p>
     <w:p>
       <w:pPr>
-        <w:spacing w:after="200" w:before="0"/>
+        <w:spacing w:after="200"/>
         <w:jc w:val="both"/>
       </w:pPr>
       <w:r>
-        <w:rPr>
-          <w:b w:val="0"/>
-        </w:rPr>
         <w:t>Pronósticos de horarios indicados para el 1, 2 de marzo y 3 de marzo 2026.</w:t>
       </w:r>
     </w:p>
@@ -126,7 +120,7 @@
     </w:p>
     <w:p>
       <w:pPr>
-        <w:spacing w:before="80" w:after="80"/>
+        <w:spacing w:before="120" w:after="80"/>
         <w:jc w:val="center"/>
       </w:pPr>
       <w:r>
@@ -138,13 +132,10 @@
       </w:r>
     </w:p>
     <w:p>
-      <w:pPr>
-        <w:jc w:val="center"/>
-      </w:pPr>
       <w:r>
         <w:drawing>
           <wp:inline xmlns:a="http://schemas.openxmlformats.org/drawingml/2006/main" xmlns:pic="http://schemas.openxmlformats.org/drawingml/2006/picture">
-            <wp:extent cx="5303520" cy="2347987"/>
+            <wp:extent cx="5486400" cy="2428952"/>
             <wp:docPr id="1" name="Picture 1"/>
             <wp:cNvGraphicFramePr>
               <a:graphicFrameLocks noChangeAspect="1"/>
@@ -165,7 +156,7 @@
                   <pic:spPr>
                     <a:xfrm>
                       <a:off x="0" y="0"/>
-                      <a:ext cx="5303520" cy="2347987"/>
+                      <a:ext cx="5486400" cy="2428952"/>
                     </a:xfrm>
                     <a:prstGeom prst="rect"/>
                   </pic:spPr>
@@ -178,12 +169,12 @@
     </w:p>
     <w:p>
       <w:pPr>
-        <w:spacing w:after="120"/>
-      </w:pPr>
-    </w:p>
-    <w:p>
-      <w:pPr>
-        <w:spacing w:before="80" w:after="80"/>
+        <w:spacing w:after="160"/>
+      </w:pPr>
+    </w:p>
+    <w:p>
+      <w:pPr>
+        <w:spacing w:before="120" w:after="80"/>
         <w:jc w:val="center"/>
       </w:pPr>
       <w:r>
@@ -195,13 +186,10 @@
       </w:r>
     </w:p>
     <w:p>
-      <w:pPr>
-        <w:jc w:val="center"/>
-      </w:pPr>
       <w:r>
         <w:drawing>
           <wp:inline xmlns:a="http://schemas.openxmlformats.org/drawingml/2006/main" xmlns:pic="http://schemas.openxmlformats.org/drawingml/2006/picture">
-            <wp:extent cx="5303520" cy="2347987"/>
+            <wp:extent cx="5486400" cy="2428952"/>
             <wp:docPr id="2" name="Picture 2"/>
             <wp:cNvGraphicFramePr>
               <a:graphicFrameLocks noChangeAspect="1"/>
@@ -222,7 +210,7 @@
                   <pic:spPr>
                     <a:xfrm>
                       <a:off x="0" y="0"/>
-                      <a:ext cx="5303520" cy="2347987"/>
+                      <a:ext cx="5486400" cy="2428952"/>
                     </a:xfrm>
                     <a:prstGeom prst="rect"/>
                   </pic:spPr>
@@ -234,13 +222,13 @@
       </w:r>
     </w:p>
     <w:p>
-      <w:r>
-        <w:br w:type="page"/>
-      </w:r>
-    </w:p>
-    <w:p>
-      <w:pPr>
-        <w:spacing w:before="80" w:after="80"/>
+      <w:pPr>
+        <w:spacing w:after="160"/>
+      </w:pPr>
+    </w:p>
+    <w:p>
+      <w:pPr>
+        <w:spacing w:before="120" w:after="80"/>
         <w:jc w:val="center"/>
       </w:pPr>
       <w:r>
@@ -252,13 +240,10 @@
       </w:r>
     </w:p>
     <w:p>
-      <w:pPr>
-        <w:jc w:val="center"/>
-      </w:pPr>
       <w:r>
         <w:drawing>
           <wp:inline xmlns:a="http://schemas.openxmlformats.org/drawingml/2006/main" xmlns:pic="http://schemas.openxmlformats.org/drawingml/2006/picture">
-            <wp:extent cx="5303520" cy="2351561"/>
+            <wp:extent cx="5486400" cy="2432649"/>
             <wp:docPr id="3" name="Picture 3"/>
             <wp:cNvGraphicFramePr>
               <a:graphicFrameLocks noChangeAspect="1"/>
@@ -279,7 +264,7 @@
                   <pic:spPr>
                     <a:xfrm>
                       <a:off x="0" y="0"/>
-                      <a:ext cx="5303520" cy="2351561"/>
+                      <a:ext cx="5486400" cy="2432649"/>
                     </a:xfrm>
                     <a:prstGeom prst="rect"/>
                   </pic:spPr>
@@ -292,12 +277,12 @@
     </w:p>
     <w:p>
       <w:pPr>
-        <w:spacing w:after="120"/>
-      </w:pPr>
-    </w:p>
-    <w:p>
-      <w:pPr>
-        <w:spacing w:before="80" w:after="80"/>
+        <w:spacing w:after="160"/>
+      </w:pPr>
+    </w:p>
+    <w:p>
+      <w:pPr>
+        <w:spacing w:before="120" w:after="80"/>
         <w:jc w:val="center"/>
       </w:pPr>
       <w:r>
@@ -309,13 +294,10 @@
       </w:r>
     </w:p>
     <w:p>
-      <w:pPr>
-        <w:jc w:val="center"/>
-      </w:pPr>
       <w:r>
         <w:drawing>
           <wp:inline xmlns:a="http://schemas.openxmlformats.org/drawingml/2006/main" xmlns:pic="http://schemas.openxmlformats.org/drawingml/2006/picture">
-            <wp:extent cx="5303520" cy="2351561"/>
+            <wp:extent cx="5486400" cy="2432649"/>
             <wp:docPr id="4" name="Picture 4"/>
             <wp:cNvGraphicFramePr>
               <a:graphicFrameLocks noChangeAspect="1"/>
@@ -336,7 +318,7 @@
                   <pic:spPr>
                     <a:xfrm>
                       <a:off x="0" y="0"/>
-                      <a:ext cx="5303520" cy="2351561"/>
+                      <a:ext cx="5486400" cy="2432649"/>
                     </a:xfrm>
                     <a:prstGeom prst="rect"/>
                   </pic:spPr>
@@ -346,6 +328,11 @@
           </wp:inline>
         </w:drawing>
       </w:r>
+    </w:p>
+    <w:p>
+      <w:pPr>
+        <w:spacing w:after="160"/>
+      </w:pPr>
     </w:p>
     <w:p>
       <w:pPr>
@@ -533,13 +520,13 @@
         <w:noProof/>
       </w:rPr>
       <w:drawing>
-        <wp:anchor distT="0" distB="0" distL="114300" distR="114300" simplePos="0" relativeHeight="251661312" behindDoc="1" locked="1" layoutInCell="1" allowOverlap="1" wp14:anchorId="652D97E8" wp14:editId="53F5DDB9">
+        <wp:anchor distT="0" distB="0" distL="114300" distR="114300" simplePos="0" relativeHeight="251661312" behindDoc="1" locked="1" layoutInCell="1" allowOverlap="1" wp14:anchorId="652D97E8" wp14:editId="4BCA4894">
           <wp:simplePos x="0" y="0"/>
           <wp:positionH relativeFrom="page">
             <wp:align>left</wp:align>
           </wp:positionH>
           <wp:positionV relativeFrom="paragraph">
-            <wp:posOffset>436880</wp:posOffset>
+            <wp:posOffset>636270</wp:posOffset>
           </wp:positionV>
           <wp:extent cx="8029575" cy="9164320"/>
           <wp:effectExtent l="0" t="0" r="9525" b="0"/>

</xml_diff>